<commit_message>
feat: update about banner to ribbon cutting webp and finalize infrastructure risk remediation plan
</commit_message>
<xml_diff>
--- a/RISK_REMEDIATION_PLAN.docx
+++ b/RISK_REMEDIATION_PLAN.docx
@@ -3893,12 +3893,12 @@
             <w:r>
               <w:rPr>
                 <w:rFonts w:ascii="Segoe UI" w:hAnsi="Segoe UI"/>
-                <w:b w:val="0"/>
+                <w:b/>
                 <w:i w:val="0"/>
-                <w:color w:val="64748B"/>
+                <w:color w:val="16A34A"/>
                 <w:sz w:val="17"/>
               </w:rPr>
-              <w:t>☐ Pending</w:t>
+              <w:t>☑ Done</w:t>
             </w:r>
           </w:p>
         </w:tc>
@@ -4038,12 +4038,12 @@
             <w:r>
               <w:rPr>
                 <w:rFonts w:ascii="Segoe UI" w:hAnsi="Segoe UI"/>
-                <w:b w:val="0"/>
+                <w:b/>
                 <w:i w:val="0"/>
-                <w:color w:val="64748B"/>
+                <w:color w:val="16A34A"/>
                 <w:sz w:val="17"/>
               </w:rPr>
-              <w:t>☐ Pending</w:t>
+              <w:t>☑ Done</w:t>
             </w:r>
           </w:p>
         </w:tc>
@@ -4183,12 +4183,12 @@
             <w:r>
               <w:rPr>
                 <w:rFonts w:ascii="Segoe UI" w:hAnsi="Segoe UI"/>
-                <w:b w:val="0"/>
+                <w:b/>
                 <w:i w:val="0"/>
-                <w:color w:val="64748B"/>
+                <w:color w:val="16A34A"/>
                 <w:sz w:val="17"/>
               </w:rPr>
-              <w:t>☐ Pending</w:t>
+              <w:t>☑ Done</w:t>
             </w:r>
           </w:p>
         </w:tc>
@@ -4442,7 +4442,7 @@
                 <w:color w:val="475569"/>
                 <w:sz w:val="17"/>
               </w:rPr>
-              <w:t>DevOps / Web Admin</w:t>
+              <w:t>DevOps / Server Admin</w:t>
             </w:r>
           </w:p>
         </w:tc>
@@ -4587,7 +4587,7 @@
                 <w:color w:val="475569"/>
                 <w:sz w:val="17"/>
               </w:rPr>
-              <w:t>DevOps / Web Admin</w:t>
+              <w:t>DevOps / Server Admin</w:t>
             </w:r>
           </w:p>
         </w:tc>
@@ -5312,7 +5312,7 @@
                 <w:color w:val="475569"/>
                 <w:sz w:val="17"/>
               </w:rPr>
-              <w:t>Legal / Web Content</w:t>
+              <w:t>Legal / Web Developer</w:t>
             </w:r>
           </w:p>
         </w:tc>

</xml_diff>